<commit_message>
Release v1.6.0: Dynamic Holographic Sights & Lock-On, 360 Orbit Yaw/Pitch, 180 Quick-Turn Polish, 3-Mode Camera Engine (Classic Fixed / OTS / ADS), and Master DOCX Update
</commit_message>
<xml_diff>
--- a/docs/Resident_Lovely_Master_Game_Design_Document.docx
+++ b/docs/Resident_Lovely_Master_Game_Design_Document.docx
@@ -39,7 +39,7 @@
           <w:sz w:val="20"/>
           <w:color w:val="475569"/>
         </w:rPr>
-        <w:t xml:space="preserve">Version: v1.5.0 (Full Graphic Overhaul & Integrated Masterwork)</w:t>
+        <w:t xml:space="preserve">Version: v1.6.0 (Advanced Sights, 360/180 Turning & 3-Mode Camera Engine)</w:t>
       </w:r>
     </w:p><w:p>
       <w:pPr>
@@ -91,7 +91,7 @@
           <w:sz w:val="22"/>
           <w:color w:val="05070A"/>
         </w:rPr>
-        <w:t xml:space="preserve">Players assume the role of Agent Joy, a cheerful operative of the S.M.I.L.E. Alpha Team, investigating the mysterious Gloom Outbreak inside the historic Chateau de la Joie mansion. Instead of horrific biological monstrosities, the estate is populated by sad, moping plushies called Grumps. By utilizing a 4-weapon arsenal of confectionery launchers, bubble shotguns, and confetti blasters, Agent Joy transforms all enemies into dancing party companions.</w:t>
+        <w:t xml:space="preserve">Players assume the role of Agent Joy, a cheerful operative of the S.M.I.L.E. Alpha Team, investigating the mysterious Gloom Outbreak inside the historic Chateau de la Joie mansion. By utilizing a 4-weapon arsenal of confectionery launchers, bubble shotguns, and confetti blasters, Agent Joy transforms all enemies into dancing party companions.</w:t>
       </w:r>
     </w:p><w:p>
       <w:pPr>
@@ -104,7 +104,7 @@
           <w:sz w:val="32"/>
           <w:color w:val="0F766E"/>
         </w:rPr>
-        <w:t xml:space="preserve">❖ 2. Graphic Overhaul & Visual Architecture (v1.5.0)</w:t>
+        <w:t xml:space="preserve">❖ 2. Camera Navigation & Sights Engine (v1.6.0)</w:t>
       </w:r>
     </w:p><w:p>
       <w:pPr>
@@ -117,67 +117,104 @@
           <w:sz w:val="26"/>
           <w:color w:val="D97706"/>
         </w:rPr>
-        <w:t xml:space="preserve">★ 2.1 Volumetric Lighting & Atmospheric Shading</w:t>
-      </w:r>
-    </w:p><w:p>
-      <w:pPr>
-        <w:ind w:left="400"/>
-        <w:spacing w:after="80"/>
-      </w:pPr>
-      <w:r>
-        <w:rPr>
-          <w:sz w:val="22"/>
-          <w:color w:val="05070A"/>
-        </w:rPr>
-        <w:t xml:space="preserve">•  Volumetric God Rays: Translucent additive pink light shafts projecting diagonally from the stained-glass rose window.</w:t>
-      </w:r>
-    </w:p><w:p>
-      <w:pPr>
-        <w:ind w:left="400"/>
-        <w:spacing w:after="80"/>
-      </w:pPr>
-      <w:r>
-        <w:rPr>
-          <w:sz w:val="22"/>
-          <w:color w:val="05070A"/>
-        </w:rPr>
-        <w:t xml:space="preserve">•  Ambient Stardust Motes: 55 floating glitter particles drifting through illuminated zones with Brownian motion.</w:t>
-      </w:r>
-    </w:p><w:p>
-      <w:pPr>
-        <w:ind w:left="400"/>
-        <w:spacing w:after="80"/>
-      </w:pPr>
-      <w:r>
-        <w:rPr>
-          <w:sz w:val="22"/>
-          <w:color w:val="05070A"/>
-        </w:rPr>
-        <w:t xml:space="preserve">•  Multi-Tier Crystal Chandelier: Gold framework with hanging crystal prisms casting refractive highlights.</w:t>
-      </w:r>
-    </w:p><w:p>
-      <w:pPr>
-        <w:ind w:left="400"/>
-        <w:spacing w:after="80"/>
-      </w:pPr>
-      <w:r>
-        <w:rPr>
-          <w:sz w:val="22"/>
-          <w:color w:val="05070A"/>
-        </w:rPr>
-        <w:t xml:space="preserve">•  Baroque Wall Wainscoting: Gilded moldings, wainscoting frames, and oil landscape paintings.</w:t>
-      </w:r>
-    </w:p><w:p>
-      <w:pPr>
-        <w:ind w:left="400"/>
-        <w:spacing w:after="80"/>
-      </w:pPr>
-      <w:r>
-        <w:rPr>
-          <w:sz w:val="22"/>
-          <w:color w:val="05070A"/>
-        </w:rPr>
-        <w:t xml:space="preserve">•  Solarium Cascading Fountain: Animated rotating water ripple rings and blooming pink rose bushes.</w:t>
+        <w:t xml:space="preserve">★ 2.1 3-Mode Camera System</w:t>
+      </w:r>
+    </w:p><w:p>
+      <w:pPr>
+        <w:ind w:left="400"/>
+        <w:spacing w:after="80"/>
+      </w:pPr>
+      <w:r>
+        <w:rPr>
+          <w:sz w:val="22"/>
+          <w:color w:val="05070A"/>
+        </w:rPr>
+        <w:t xml:space="preserve">•  Mode 1: Dynamic 360 Over-the-Shoulder (OTS) with free yaw orbit and pitch vertical elevation.</w:t>
+      </w:r>
+    </w:p><w:p>
+      <w:pPr>
+        <w:ind w:left="400"/>
+        <w:spacing w:after="80"/>
+      </w:pPr>
+      <w:r>
+        <w:rPr>
+          <w:sz w:val="22"/>
+          <w:color w:val="05070A"/>
+        </w:rPr>
+        <w:t xml:space="preserve">•  Mode 2: Classic Fixed Cinematic Camera Angles (Authentic Resident Evil Spencer Mansion style with preset cinematic room vantages and automatic trigger switching).</w:t>
+      </w:r>
+    </w:p><w:p>
+      <w:pPr>
+        <w:ind w:left="400"/>
+        <w:spacing w:after="80"/>
+      </w:pPr>
+      <w:r>
+        <w:rPr>
+          <w:sz w:val="22"/>
+          <w:color w:val="05070A"/>
+        </w:rPr>
+        <w:t xml:space="preserve">•  Mode 3: Precision First-Person / ADS Down-the-Sights View for immersive confetti sniping.</w:t>
+      </w:r>
+    </w:p><w:p>
+      <w:pPr>
+        <w:ind w:left="400"/>
+        <w:spacing w:after="80"/>
+      </w:pPr>
+      <w:r>
+        <w:rPr>
+          <w:sz w:val="22"/>
+          <w:color w:val="05070A"/>
+        </w:rPr>
+        <w:t xml:space="preserve">•  Instant toggle via Key V or HUD [VIEW] button.</w:t>
+      </w:r>
+    </w:p><w:p>
+      <w:pPr>
+        
+        <w:spacing w:after="140"/>
+      </w:pPr>
+      <w:r>
+        <w:rPr>
+          <w:b/>
+          <w:sz w:val="26"/>
+          <w:color w:val="D97706"/>
+        </w:rPr>
+        <w:t xml:space="preserve">★ 2.2 Dynamic Holographic Sights & Target Lock-On</w:t>
+      </w:r>
+    </w:p><w:p>
+      <w:pPr>
+        <w:ind w:left="400"/>
+        <w:spacing w:after="80"/>
+      </w:pPr>
+      <w:r>
+        <w:rPr>
+          <w:sz w:val="22"/>
+          <w:color w:val="05070A"/>
+        </w:rPr>
+        <w:t xml:space="preserve">•  Real-time Raycasting identifies closest Grump in line-of-sight when aiming.</w:t>
+      </w:r>
+    </w:p><w:p>
+      <w:pPr>
+        <w:ind w:left="400"/>
+        <w:spacing w:after="80"/>
+      </w:pPr>
+      <w:r>
+        <w:rPr>
+          <w:sz w:val="22"/>
+          <w:color w:val="05070A"/>
+        </w:rPr>
+        <w:t xml:space="preserve">•  HUD Lock-On Box with target name and range telemetry (e.g. LOCKED: GLOOM BEAR 7.2m).</w:t>
+      </w:r>
+    </w:p><w:p>
+      <w:pPr>
+        <w:ind w:left="400"/>
+        <w:spacing w:after="80"/>
+      </w:pPr>
+      <w:r>
+        <w:rPr>
+          <w:sz w:val="22"/>
+          <w:color w:val="05070A"/>
+        </w:rPr>
+        <w:t xml:space="preserve">•  180-Degree Quick-Turn (Key Z / S+Space / HUD Button) with camera whip and swoosh audio.</w:t>
       </w:r>
     </w:p><w:p>
       <w:pPr>
@@ -238,18 +275,6 @@
           <w:sz w:val="22"/>
           <w:color w:val="05070A"/>
         </w:rPr>
-        <w:t xml:space="preserve">•  180-Degree Quick-Turn: Instant character spin with camera follow whip and audio swoosh.</w:t>
-      </w:r>
-    </w:p><w:p>
-      <w:pPr>
-        <w:ind w:left="400"/>
-        <w:spacing w:after="80"/>
-      </w:pPr>
-      <w:r>
-        <w:rPr>
-          <w:sz w:val="22"/>
-          <w:color w:val="05070A"/>
-        </w:rPr>
         <w:t xml:space="preserve">•  Typewriter Save Chronicle Modal: Classic prompt with mechanical keystrokes and carriage return bell.</w:t>
       </w:r>
     </w:p><w:p>
@@ -420,7 +445,7 @@
           <w:sz w:val="22"/>
           <w:color w:val="05070A"/>
         </w:rPr>
-        <w:t xml:space="preserve">•  Phase 7 (v1.6.0): Confectionery Kitchen Wing & Master Chef Boss [IN PROGRESS]</w:t>
+        <w:t xml:space="preserve">•  Phase 7 (v1.6.0): Advanced Sights, 360/180 Turn, 3-Mode Camera Engine (Fixed/OTS/ADS) [100% COMPLETE]</w:t>
       </w:r>
     </w:p><w:p>
       <w:pPr>

</xml_diff>